<commit_message>
Remove cluttered star-schema arrows from diagram, keep cardinality explanation in text
Co-Authored-By: Claude Opus 4.8 <noreply@anthropic.com>
</commit_message>
<xml_diff>
--- a/Partie2_transformations.docx
+++ b/Partie2_transformations.docx
@@ -259,6 +259,11 @@
     <w:p>
       <w:r>
         <w:t>We chose the « user » grain for the fact table because severity is measured per person; this makes it easy to cross-analyze with the time, the location and the type of vehicle.</w:t>
+      </w:r>
+    </w:p>
+    <w:p>
+      <w:r>
+        <w:t>Cardinality: each dim_accident row can relate to several fact_users rows (one accident, several people involved) — a 1-to-N relationship. Same for dim_vehicle to fact_users (one vehicle, several occupants): 1-to-N as well.</w:t>
       </w:r>
     </w:p>
     <w:p>

</xml_diff>